<commit_message>
docs: align documentation and publications with September evidence
</commit_message>
<xml_diff>
--- a/docs/publishing/executive-briefing/files/engineering-governance-whitepaper.docx
+++ b/docs/publishing/executive-briefing/files/engineering-governance-whitepaper.docx
@@ -23,9 +23,9 @@
         <w:rPr>
           <w:sz w:val="20"/>
         </w:rPr>
-        <w:t>Ausgabe 1.0</w:t>
+        <w:t>Ausgabe 1.1</w:t>
         <w:br/>
-        <w:t>9. September 2026</w:t>
+        <w:t>11. September 2026</w:t>
         <w:br/>
         <w:t>Projekt devsecops-governance-framework</w:t>
       </w:r>
@@ -52,7 +52,7 @@
     </w:p>
     <w:p>
       <w:r>
-        <w:t>Leseführung: Die folgenden Seiten behandeln Nutzen, Funktionsweise, Aussagekraft der Nachweise, belegten Stand und Einführung. Quellen und Begriffe stehen am Ende. Grundlage ist der Repository-Stand vom 9. September 2026, Commit 6893577. Spätere Änderungen sind nicht Bestandteil dieser Ausgabe.</w:t>
+        <w:t>Leseführung: Die folgenden Seiten behandeln Nutzen, Funktionsweise, Aussagekraft der Nachweise, belegten Stand und Einführung. Quellen und Begriffe stehen am Ende. Grundlage ist der angenommene Repository-Stand vom 11. September 2026, Commit 4abe882. Spätere Änderungen sind nicht Bestandteil dieser Ausgabe.</w:t>
       </w:r>
     </w:p>
     <w:p>
@@ -915,7 +915,7 @@
     </w:p>
     <w:p>
       <w:r>
-        <w:t>Die gespeicherten Referenzläufe von ha-CPsWMS stammen vom 15. Juli 2026. Damals bestanden 16 von 16 DevSecOps-Kontrollen und vier von vier Architekturgates. Die Laufnummern 29415015878 und 29415015294 machen diese Aussage überprüfbar. Die Ergebnisse belegen die Integration zum damaligen Zeitpunkt. Sie belegen keine aktuelle Bewertung der Anwendung im September. [8]</w:t>
+        <w:t>Am 11. September 2026 wurden neue reale Consumer-Ergebnisse angenommen. ha-CPsWMS besteht 16 von 16 anwendbaren DevSecOps-Kontrollen und vier von vier Architekturgates in den Läufen 34602002201 und 34602001140. Ein separater DevSecOps-Replay-Befund bleibt offen. Das Portfolio umfasst drei Consumer ohne veraltete oder fehlende Ergebnisse zum Beobachtungszeitpunkt. Die Factory meldet einen Branchschutz-Befund; der neutrale Demo-Consumer zeigt 25 Architektur-Befunde. Dessen bestandenes DevSecOps-Gate ist eine zusammengefasste Auswertung, kein vollständiger Kontrollkatalog. [8, 17, 18]</w:t>
       </w:r>
     </w:p>
     <w:p>
@@ -1207,7 +1207,7 @@
                 <w:color w:val="000000"/>
                 <w:sz w:val="21"/>
               </w:rPr>
-              <w:t>Sammlung, Review und zentrale Anzeige</w:t>
+              <w:t>Frische Ergebnisse für drei Consumer angenommen</w:t>
             </w:r>
           </w:p>
         </w:tc>
@@ -1239,7 +1239,7 @@
                 <w:color w:val="000000"/>
                 <w:sz w:val="21"/>
               </w:rPr>
-              <w:t>Aktuelle reale Anwendungsergebnisse</w:t>
+              <w:t>Wiederholbarkeit und Befundbearbeitung im Alltag</w:t>
             </w:r>
           </w:p>
         </w:tc>
@@ -1911,7 +1911,7 @@
     </w:p>
     <w:p>
       <w:r>
-        <w:t>Diese Ausgabe ist eine abgeleitete Veröffentlichung für die Geschäftsführung. Sie ändert keine fachlichen Vorgaben und erteilt keine Betriebs-, Risiko- oder Budgetfreigabe. Quellen beziehen sich auf den festgehaltenen Repository-Stand. Ergebnisse vom Juli bleiben als historische Nachweise gekennzeichnet.</w:t>
+        <w:t>Diese Ausgabe ist eine abgeleitete Veröffentlichung für die Geschäftsführung. Sie ändert keine fachlichen Vorgaben und erteilt keine Betriebs-, Risiko- oder Budgetfreigabe. Quellen beziehen sich auf den festgehaltenen Repository-Stand. Die dargestellten Anwendungsergebnisse wurden am 11. September 2026 angenommen.</w:t>
       </w:r>
     </w:p>
     <w:tbl>
@@ -2587,7 +2587,7 @@
             <w:color w:val="164C63"/>
             <w:sz w:val="18"/>
           </w:rPr>
-          <w:t>Stand und datierte Referenznachweise</w:t>
+          <w:t>Angenommene DevSecOps-Ergebnisse und Trust-Kontext</w:t>
         </w:r>
       </w:hyperlink>
     </w:p>
@@ -2759,6 +2759,48 @@
         </w:r>
       </w:hyperlink>
     </w:p>
+    <w:p>
+      <w:pPr>
+        <w:spacing w:after="80" w:line="240" w:lineRule="auto"/>
+      </w:pPr>
+      <w:r>
+        <w:rPr>
+          <w:sz w:val="18"/>
+          <w:sz w:val="18"/>
+        </w:rPr>
+        <w:t xml:space="preserve">[17] </w:t>
+      </w:r>
+      <w:hyperlink r:id="rId27">
+        <w:r>
+          <w:rPr>
+            <w:color w:val="164C63"/>
+            <w:sz w:val="18"/>
+          </w:rPr>
+          <w:t>Angenommene Architektur-Ergebnisse</w:t>
+        </w:r>
+      </w:hyperlink>
+    </w:p>
+    <w:p>
+      <w:pPr>
+        <w:spacing w:after="80" w:line="240" w:lineRule="auto"/>
+      </w:pPr>
+      <w:r>
+        <w:rPr>
+          <w:sz w:val="18"/>
+          <w:sz w:val="18"/>
+        </w:rPr>
+        <w:t xml:space="preserve">[18] </w:t>
+      </w:r>
+      <w:hyperlink r:id="rId28">
+        <w:r>
+          <w:rPr>
+            <w:color w:val="164C63"/>
+            <w:sz w:val="18"/>
+          </w:rPr>
+          <w:t>Portfolio am 11. September 2026</w:t>
+        </w:r>
+      </w:hyperlink>
+    </w:p>
     <w:sectPr>
       <w:headerReference w:type="default" r:id="rId9"/>
       <w:footerReference w:type="default" r:id="rId10"/>
@@ -2782,7 +2824,7 @@
       <w:rPr>
         <w:sz w:val="16"/>
       </w:rPr>
-      <w:t xml:space="preserve">Stand 9. September 2026    </w:t>
+      <w:t xml:space="preserve">Stand 11. September 2026    </w:t>
     </w:r>
     <w:r>
       <w:rPr>

</xml_diff>